<commit_message>
fixup! added docs for ICA
</commit_message>
<xml_diff>
--- a/doc/ICA.docx
+++ b/doc/ICA.docx
@@ -391,6 +391,7 @@
             </w:tabs>
             <w:rPr>
               <w:rFonts w:asciiTheme="minorHAnsi" w:eastAsiaTheme="minorEastAsia" w:hAnsiTheme="minorHAnsi"/>
+              <w:noProof/>
               <w:sz w:val="22"/>
               <w:lang w:eastAsia="uk-UA"/>
             </w:rPr>
@@ -411,46 +412,58 @@
             </w:rPr>
             <w:fldChar w:fldCharType="separate"/>
           </w:r>
-          <w:hyperlink w:anchor="_Toc225335298">
+          <w:hyperlink w:anchor="_Toc229944566" w:history="1">
             <w:r>
               <w:rPr>
-                <w:rStyle w:val="IndexLink"/>
-                <w:webHidden/>
+                <w:rStyle w:val="aa"/>
+                <w:noProof/>
               </w:rPr>
               <w:t>Визначення завдання</w:t>
             </w:r>
             <w:r>
               <w:rPr>
+                <w:noProof/>
+                <w:webHidden/>
+              </w:rPr>
+              <w:tab/>
+            </w:r>
+            <w:r>
+              <w:rPr>
+                <w:noProof/>
                 <w:webHidden/>
               </w:rPr>
               <w:fldChar w:fldCharType="begin"/>
             </w:r>
             <w:r>
               <w:rPr>
+                <w:noProof/>
                 <w:webHidden/>
               </w:rPr>
-              <w:instrText>PAGEREF _Toc225335298 \h</w:instrText>
+              <w:instrText xml:space="preserve"> PAGEREF _Toc229944566 \h </w:instrText>
             </w:r>
             <w:r>
               <w:rPr>
+                <w:noProof/>
                 <w:webHidden/>
               </w:rPr>
             </w:r>
             <w:r>
               <w:rPr>
+                <w:noProof/>
                 <w:webHidden/>
               </w:rPr>
               <w:fldChar w:fldCharType="separate"/>
             </w:r>
             <w:r>
               <w:rPr>
-                <w:rStyle w:val="IndexLink"/>
+                <w:noProof/>
+                <w:webHidden/>
               </w:rPr>
-              <w:tab/>
               <w:t>3</w:t>
             </w:r>
             <w:r>
               <w:rPr>
+                <w:noProof/>
                 <w:webHidden/>
               </w:rPr>
               <w:fldChar w:fldCharType="end"/>
@@ -465,50 +478,63 @@
             </w:tabs>
             <w:rPr>
               <w:rFonts w:asciiTheme="minorHAnsi" w:eastAsiaTheme="minorEastAsia" w:hAnsiTheme="minorHAnsi"/>
+              <w:noProof/>
               <w:sz w:val="22"/>
               <w:lang w:eastAsia="uk-UA"/>
             </w:rPr>
           </w:pPr>
-          <w:hyperlink w:anchor="_Toc225335299">
+          <w:hyperlink w:anchor="_Toc229944567" w:history="1">
             <w:r>
               <w:rPr>
-                <w:rStyle w:val="IndexLink"/>
-                <w:webHidden/>
+                <w:rStyle w:val="aa"/>
+                <w:noProof/>
               </w:rPr>
               <w:t>Код до завдання</w:t>
             </w:r>
             <w:r>
               <w:rPr>
+                <w:noProof/>
+                <w:webHidden/>
+              </w:rPr>
+              <w:tab/>
+            </w:r>
+            <w:r>
+              <w:rPr>
+                <w:noProof/>
                 <w:webHidden/>
               </w:rPr>
               <w:fldChar w:fldCharType="begin"/>
             </w:r>
             <w:r>
               <w:rPr>
+                <w:noProof/>
                 <w:webHidden/>
               </w:rPr>
-              <w:instrText>PAGEREF _Toc225335299 \h</w:instrText>
+              <w:instrText xml:space="preserve"> PAGEREF _Toc229944567 \h </w:instrText>
             </w:r>
             <w:r>
               <w:rPr>
+                <w:noProof/>
                 <w:webHidden/>
               </w:rPr>
             </w:r>
             <w:r>
               <w:rPr>
+                <w:noProof/>
                 <w:webHidden/>
               </w:rPr>
               <w:fldChar w:fldCharType="separate"/>
             </w:r>
             <w:r>
               <w:rPr>
-                <w:rStyle w:val="IndexLink"/>
+                <w:noProof/>
+                <w:webHidden/>
               </w:rPr>
-              <w:tab/>
               <w:t>3</w:t>
             </w:r>
             <w:r>
               <w:rPr>
+                <w:noProof/>
                 <w:webHidden/>
               </w:rPr>
               <w:fldChar w:fldCharType="end"/>
@@ -523,51 +549,214 @@
             </w:tabs>
             <w:rPr>
               <w:rFonts w:asciiTheme="minorHAnsi" w:eastAsiaTheme="minorEastAsia" w:hAnsiTheme="minorHAnsi"/>
+              <w:noProof/>
               <w:sz w:val="22"/>
               <w:lang w:eastAsia="uk-UA"/>
             </w:rPr>
           </w:pPr>
-          <w:hyperlink w:anchor="_Toc225335300">
+          <w:hyperlink w:anchor="_Toc229944568" w:history="1">
             <w:r>
               <w:rPr>
-                <w:rStyle w:val="IndexLink"/>
-                <w:webHidden/>
-                <w:lang w:val="ru-RU"/>
+                <w:rStyle w:val="aa"/>
+                <w:noProof/>
               </w:rPr>
-              <w:t>Код UI/gui/TkinterViewer.py</w:t>
+              <w:t>К</w:t>
             </w:r>
             <w:r>
               <w:rPr>
+                <w:rStyle w:val="aa"/>
+                <w:noProof/>
+                <w:lang w:val="ru-RU"/>
+              </w:rPr>
+              <w:t>од core/exporter.py</w:t>
+            </w:r>
+            <w:r>
+              <w:rPr>
+                <w:noProof/>
+                <w:webHidden/>
+              </w:rPr>
+              <w:tab/>
+            </w:r>
+            <w:r>
+              <w:rPr>
+                <w:noProof/>
                 <w:webHidden/>
               </w:rPr>
               <w:fldChar w:fldCharType="begin"/>
             </w:r>
             <w:r>
               <w:rPr>
+                <w:noProof/>
                 <w:webHidden/>
               </w:rPr>
-              <w:instrText>PAGEREF _Toc225335300 \h</w:instrText>
+              <w:instrText xml:space="preserve"> PAGEREF _Toc229944568 \h </w:instrText>
             </w:r>
             <w:r>
               <w:rPr>
+                <w:noProof/>
                 <w:webHidden/>
               </w:rPr>
             </w:r>
             <w:r>
               <w:rPr>
+                <w:noProof/>
                 <w:webHidden/>
               </w:rPr>
               <w:fldChar w:fldCharType="separate"/>
             </w:r>
             <w:r>
               <w:rPr>
-                <w:rStyle w:val="IndexLink"/>
+                <w:noProof/>
+                <w:webHidden/>
               </w:rPr>
-              <w:tab/>
               <w:t>3</w:t>
             </w:r>
             <w:r>
               <w:rPr>
+                <w:noProof/>
+                <w:webHidden/>
+              </w:rPr>
+              <w:fldChar w:fldCharType="end"/>
+            </w:r>
+          </w:hyperlink>
+        </w:p>
+        <w:p>
+          <w:pPr>
+            <w:pStyle w:val="21"/>
+            <w:tabs>
+              <w:tab w:val="right" w:leader="dot" w:pos="9629"/>
+            </w:tabs>
+            <w:rPr>
+              <w:rFonts w:asciiTheme="minorHAnsi" w:eastAsiaTheme="minorEastAsia" w:hAnsiTheme="minorHAnsi"/>
+              <w:noProof/>
+              <w:sz w:val="22"/>
+              <w:lang w:eastAsia="uk-UA"/>
+            </w:rPr>
+          </w:pPr>
+          <w:hyperlink w:anchor="_Toc229944569" w:history="1">
+            <w:r>
+              <w:rPr>
+                <w:rStyle w:val="aa"/>
+                <w:noProof/>
+                <w:lang w:val="ru-RU"/>
+              </w:rPr>
+              <w:t>Код exporters/excel/exporter.py</w:t>
+            </w:r>
+            <w:r>
+              <w:rPr>
+                <w:noProof/>
+                <w:webHidden/>
+              </w:rPr>
+              <w:tab/>
+            </w:r>
+            <w:r>
+              <w:rPr>
+                <w:noProof/>
+                <w:webHidden/>
+              </w:rPr>
+              <w:fldChar w:fldCharType="begin"/>
+            </w:r>
+            <w:r>
+              <w:rPr>
+                <w:noProof/>
+                <w:webHidden/>
+              </w:rPr>
+              <w:instrText xml:space="preserve"> PAGEREF _Toc229944569 \h </w:instrText>
+            </w:r>
+            <w:r>
+              <w:rPr>
+                <w:noProof/>
+                <w:webHidden/>
+              </w:rPr>
+            </w:r>
+            <w:r>
+              <w:rPr>
+                <w:noProof/>
+                <w:webHidden/>
+              </w:rPr>
+              <w:fldChar w:fldCharType="separate"/>
+            </w:r>
+            <w:r>
+              <w:rPr>
+                <w:noProof/>
+                <w:webHidden/>
+              </w:rPr>
+              <w:t>3</w:t>
+            </w:r>
+            <w:r>
+              <w:rPr>
+                <w:noProof/>
+                <w:webHidden/>
+              </w:rPr>
+              <w:fldChar w:fldCharType="end"/>
+            </w:r>
+          </w:hyperlink>
+        </w:p>
+        <w:p>
+          <w:pPr>
+            <w:pStyle w:val="21"/>
+            <w:tabs>
+              <w:tab w:val="right" w:leader="dot" w:pos="9629"/>
+            </w:tabs>
+            <w:rPr>
+              <w:rFonts w:asciiTheme="minorHAnsi" w:eastAsiaTheme="minorEastAsia" w:hAnsiTheme="minorHAnsi"/>
+              <w:noProof/>
+              <w:sz w:val="22"/>
+              <w:lang w:eastAsia="uk-UA"/>
+            </w:rPr>
+          </w:pPr>
+          <w:hyperlink w:anchor="_Toc229944570" w:history="1">
+            <w:r>
+              <w:rPr>
+                <w:rStyle w:val="aa"/>
+                <w:noProof/>
+              </w:rPr>
+              <w:t>Уривок коду UI/gui/TkinterViewer.py</w:t>
+            </w:r>
+            <w:r>
+              <w:rPr>
+                <w:noProof/>
+                <w:webHidden/>
+              </w:rPr>
+              <w:tab/>
+            </w:r>
+            <w:r>
+              <w:rPr>
+                <w:noProof/>
+                <w:webHidden/>
+              </w:rPr>
+              <w:fldChar w:fldCharType="begin"/>
+            </w:r>
+            <w:r>
+              <w:rPr>
+                <w:noProof/>
+                <w:webHidden/>
+              </w:rPr>
+              <w:instrText xml:space="preserve"> PAGEREF _Toc229944570 \h </w:instrText>
+            </w:r>
+            <w:r>
+              <w:rPr>
+                <w:noProof/>
+                <w:webHidden/>
+              </w:rPr>
+            </w:r>
+            <w:r>
+              <w:rPr>
+                <w:noProof/>
+                <w:webHidden/>
+              </w:rPr>
+              <w:fldChar w:fldCharType="separate"/>
+            </w:r>
+            <w:r>
+              <w:rPr>
+                <w:noProof/>
+                <w:webHidden/>
+              </w:rPr>
+              <w:t>5</w:t>
+            </w:r>
+            <w:r>
+              <w:rPr>
+                <w:noProof/>
                 <w:webHidden/>
               </w:rPr>
               <w:fldChar w:fldCharType="end"/>
@@ -582,50 +771,63 @@
             </w:tabs>
             <w:rPr>
               <w:rFonts w:asciiTheme="minorHAnsi" w:eastAsiaTheme="minorEastAsia" w:hAnsiTheme="minorHAnsi"/>
+              <w:noProof/>
               <w:sz w:val="22"/>
               <w:lang w:eastAsia="uk-UA"/>
             </w:rPr>
           </w:pPr>
-          <w:hyperlink w:anchor="_Toc225335301">
+          <w:hyperlink w:anchor="_Toc229944571" w:history="1">
             <w:r>
               <w:rPr>
-                <w:rStyle w:val="IndexLink"/>
-                <w:webHidden/>
+                <w:rStyle w:val="aa"/>
+                <w:noProof/>
               </w:rPr>
               <w:t>Діаграма</w:t>
             </w:r>
             <w:r>
               <w:rPr>
+                <w:noProof/>
+                <w:webHidden/>
+              </w:rPr>
+              <w:tab/>
+            </w:r>
+            <w:r>
+              <w:rPr>
+                <w:noProof/>
                 <w:webHidden/>
               </w:rPr>
               <w:fldChar w:fldCharType="begin"/>
             </w:r>
             <w:r>
               <w:rPr>
+                <w:noProof/>
                 <w:webHidden/>
               </w:rPr>
-              <w:instrText>PAGEREF _Toc225335301 \h</w:instrText>
+              <w:instrText xml:space="preserve"> PAGEREF _Toc229944571 \h </w:instrText>
             </w:r>
             <w:r>
               <w:rPr>
+                <w:noProof/>
                 <w:webHidden/>
               </w:rPr>
             </w:r>
             <w:r>
               <w:rPr>
+                <w:noProof/>
                 <w:webHidden/>
               </w:rPr>
               <w:fldChar w:fldCharType="separate"/>
             </w:r>
             <w:r>
               <w:rPr>
-                <w:rStyle w:val="IndexLink"/>
+                <w:noProof/>
+                <w:webHidden/>
               </w:rPr>
-              <w:tab/>
-              <w:t>3</w:t>
+              <w:t>7</w:t>
             </w:r>
             <w:r>
               <w:rPr>
+                <w:noProof/>
                 <w:webHidden/>
               </w:rPr>
               <w:fldChar w:fldCharType="end"/>
@@ -640,50 +842,63 @@
             </w:tabs>
             <w:rPr>
               <w:rFonts w:asciiTheme="minorHAnsi" w:eastAsiaTheme="minorEastAsia" w:hAnsiTheme="minorHAnsi"/>
+              <w:noProof/>
               <w:sz w:val="22"/>
               <w:lang w:eastAsia="uk-UA"/>
             </w:rPr>
           </w:pPr>
-          <w:hyperlink w:anchor="_Toc225335302">
+          <w:hyperlink w:anchor="_Toc229944572" w:history="1">
             <w:r>
               <w:rPr>
-                <w:rStyle w:val="IndexLink"/>
-                <w:webHidden/>
+                <w:rStyle w:val="aa"/>
+                <w:noProof/>
               </w:rPr>
               <w:t>Приклад використання модуля</w:t>
             </w:r>
             <w:r>
               <w:rPr>
+                <w:noProof/>
+                <w:webHidden/>
+              </w:rPr>
+              <w:tab/>
+            </w:r>
+            <w:r>
+              <w:rPr>
+                <w:noProof/>
                 <w:webHidden/>
               </w:rPr>
               <w:fldChar w:fldCharType="begin"/>
             </w:r>
             <w:r>
               <w:rPr>
+                <w:noProof/>
                 <w:webHidden/>
               </w:rPr>
-              <w:instrText>PAGEREF _Toc225335302 \h</w:instrText>
+              <w:instrText xml:space="preserve"> PAGEREF _Toc229944572 \h </w:instrText>
             </w:r>
             <w:r>
               <w:rPr>
+                <w:noProof/>
                 <w:webHidden/>
               </w:rPr>
             </w:r>
             <w:r>
               <w:rPr>
+                <w:noProof/>
                 <w:webHidden/>
               </w:rPr>
               <w:fldChar w:fldCharType="separate"/>
             </w:r>
             <w:r>
               <w:rPr>
-                <w:rStyle w:val="IndexLink"/>
+                <w:noProof/>
+                <w:webHidden/>
               </w:rPr>
-              <w:tab/>
-              <w:t>13</w:t>
+              <w:t>8</w:t>
             </w:r>
             <w:r>
               <w:rPr>
+                <w:noProof/>
                 <w:webHidden/>
               </w:rPr>
               <w:fldChar w:fldCharType="end"/>
@@ -698,50 +913,63 @@
             </w:tabs>
             <w:rPr>
               <w:rFonts w:asciiTheme="minorHAnsi" w:eastAsiaTheme="minorEastAsia" w:hAnsiTheme="minorHAnsi"/>
+              <w:noProof/>
               <w:sz w:val="22"/>
               <w:lang w:eastAsia="uk-UA"/>
             </w:rPr>
           </w:pPr>
-          <w:hyperlink w:anchor="_Toc225335303">
+          <w:hyperlink w:anchor="_Toc229944573" w:history="1">
             <w:r>
               <w:rPr>
-                <w:rStyle w:val="IndexLink"/>
-                <w:webHidden/>
+                <w:rStyle w:val="aa"/>
+                <w:noProof/>
               </w:rPr>
               <w:t>Висновки</w:t>
             </w:r>
             <w:r>
               <w:rPr>
+                <w:noProof/>
+                <w:webHidden/>
+              </w:rPr>
+              <w:tab/>
+            </w:r>
+            <w:r>
+              <w:rPr>
+                <w:noProof/>
                 <w:webHidden/>
               </w:rPr>
               <w:fldChar w:fldCharType="begin"/>
             </w:r>
             <w:r>
               <w:rPr>
+                <w:noProof/>
                 <w:webHidden/>
               </w:rPr>
-              <w:instrText>PAGEREF _Toc225335303 \h</w:instrText>
+              <w:instrText xml:space="preserve"> PAGEREF _Toc229944573 \h </w:instrText>
             </w:r>
             <w:r>
               <w:rPr>
+                <w:noProof/>
                 <w:webHidden/>
               </w:rPr>
             </w:r>
             <w:r>
               <w:rPr>
+                <w:noProof/>
                 <w:webHidden/>
               </w:rPr>
               <w:fldChar w:fldCharType="separate"/>
             </w:r>
             <w:r>
               <w:rPr>
-                <w:rStyle w:val="IndexLink"/>
+                <w:noProof/>
+                <w:webHidden/>
               </w:rPr>
-              <w:tab/>
-              <w:t>14</w:t>
+              <w:t>9</w:t>
             </w:r>
             <w:r>
               <w:rPr>
+                <w:noProof/>
                 <w:webHidden/>
               </w:rPr>
               <w:fldChar w:fldCharType="end"/>
@@ -756,50 +984,63 @@
             </w:tabs>
             <w:rPr>
               <w:rFonts w:asciiTheme="minorHAnsi" w:eastAsiaTheme="minorEastAsia" w:hAnsiTheme="minorHAnsi"/>
+              <w:noProof/>
               <w:sz w:val="22"/>
               <w:lang w:eastAsia="uk-UA"/>
             </w:rPr>
           </w:pPr>
-          <w:hyperlink w:anchor="_Toc225335304">
+          <w:hyperlink w:anchor="_Toc229944574" w:history="1">
             <w:r>
               <w:rPr>
-                <w:rStyle w:val="IndexLink"/>
-                <w:webHidden/>
+                <w:rStyle w:val="aa"/>
+                <w:noProof/>
               </w:rPr>
               <w:t>Джерела</w:t>
             </w:r>
             <w:r>
               <w:rPr>
+                <w:noProof/>
+                <w:webHidden/>
+              </w:rPr>
+              <w:tab/>
+            </w:r>
+            <w:r>
+              <w:rPr>
+                <w:noProof/>
                 <w:webHidden/>
               </w:rPr>
               <w:fldChar w:fldCharType="begin"/>
             </w:r>
             <w:r>
               <w:rPr>
+                <w:noProof/>
                 <w:webHidden/>
               </w:rPr>
-              <w:instrText>PAGEREF _Toc225335304 \h</w:instrText>
+              <w:instrText xml:space="preserve"> PAGEREF _Toc229944574 \h </w:instrText>
             </w:r>
             <w:r>
               <w:rPr>
+                <w:noProof/>
                 <w:webHidden/>
               </w:rPr>
             </w:r>
             <w:r>
               <w:rPr>
+                <w:noProof/>
                 <w:webHidden/>
               </w:rPr>
               <w:fldChar w:fldCharType="separate"/>
             </w:r>
             <w:r>
               <w:rPr>
-                <w:rStyle w:val="IndexLink"/>
+                <w:noProof/>
+                <w:webHidden/>
               </w:rPr>
-              <w:tab/>
-              <w:t>14</w:t>
+              <w:t>9</w:t>
             </w:r>
             <w:r>
               <w:rPr>
+                <w:noProof/>
                 <w:webHidden/>
               </w:rPr>
               <w:fldChar w:fldCharType="end"/>
@@ -829,7 +1070,7 @@
         <w:pStyle w:val="1"/>
         <w:spacing w:before="0"/>
       </w:pPr>
-      <w:bookmarkStart w:id="0" w:name="_Toc225335298"/>
+      <w:bookmarkStart w:id="0" w:name="_Toc229944566"/>
       <w:r>
         <w:lastRenderedPageBreak/>
         <w:t>Визначення завдання</w:t>
@@ -1185,7 +1426,7 @@
       <w:pPr>
         <w:pStyle w:val="1"/>
       </w:pPr>
-      <w:bookmarkStart w:id="1" w:name="_Toc225335299"/>
+      <w:bookmarkStart w:id="1" w:name="_Toc229944567"/>
       <w:r>
         <w:t>Код до завдання</w:t>
       </w:r>
@@ -1198,7 +1439,7 @@
           <w:lang w:val="ru-RU"/>
         </w:rPr>
       </w:pPr>
-      <w:bookmarkStart w:id="2" w:name="_Toc225335300"/>
+      <w:bookmarkStart w:id="2" w:name="_Toc229944568"/>
       <w:r>
         <w:t>К</w:t>
       </w:r>
@@ -1208,13 +1449,13 @@
         </w:rPr>
         <w:t xml:space="preserve">од </w:t>
       </w:r>
+      <w:r>
+        <w:rPr>
+          <w:lang w:val="ru-RU"/>
+        </w:rPr>
+        <w:t>core/exporter.py</w:t>
+      </w:r>
       <w:bookmarkEnd w:id="2"/>
-      <w:r>
-        <w:rPr>
-          <w:lang w:val="ru-RU"/>
-        </w:rPr>
-        <w:t>core/exporter.py</w:t>
-      </w:r>
     </w:p>
     <w:p>
       <w:pPr>
@@ -1296,7 +1537,6 @@
         <w:t xml:space="preserve"> </w:t>
       </w:r>
       <w:proofErr w:type="spellStart"/>
-      <w:proofErr w:type="gramStart"/>
       <w:r>
         <w:rPr>
           <w:lang w:val="ru-RU"/>
@@ -1304,7 +1544,6 @@
         <w:t>core.events</w:t>
       </w:r>
       <w:proofErr w:type="spellEnd"/>
-      <w:proofErr w:type="gramEnd"/>
       <w:r>
         <w:rPr>
           <w:lang w:val="ru-RU"/>
@@ -1356,7 +1595,6 @@
         <w:t xml:space="preserve"> </w:t>
       </w:r>
       <w:proofErr w:type="spellStart"/>
-      <w:proofErr w:type="gramStart"/>
       <w:r>
         <w:rPr>
           <w:lang w:val="ru-RU"/>
@@ -1364,7 +1602,6 @@
         <w:t>core.response</w:t>
       </w:r>
       <w:proofErr w:type="spellEnd"/>
-      <w:proofErr w:type="gramEnd"/>
       <w:r>
         <w:rPr>
           <w:lang w:val="ru-RU"/>
@@ -1416,7 +1653,6 @@
         <w:t xml:space="preserve"> </w:t>
       </w:r>
       <w:proofErr w:type="spellStart"/>
-      <w:proofErr w:type="gramStart"/>
       <w:r>
         <w:rPr>
           <w:lang w:val="ru-RU"/>
@@ -1428,15 +1664,278 @@
         <w:rPr>
           <w:lang w:val="ru-RU"/>
         </w:rPr>
+        <w:t>(ABC):</w:t>
+      </w:r>
+    </w:p>
+    <w:p>
+      <w:pPr>
+        <w:pStyle w:val="a9"/>
+        <w:rPr>
+          <w:lang w:val="ru-RU"/>
+        </w:rPr>
+      </w:pPr>
+      <w:r>
+        <w:rPr>
+          <w:lang w:val="ru-RU"/>
+        </w:rPr>
+        <w:t xml:space="preserve">    </w:t>
+      </w:r>
+      <w:proofErr w:type="spellStart"/>
+      <w:r>
+        <w:rPr>
+          <w:lang w:val="ru-RU"/>
+        </w:rPr>
+        <w:t>display_name</w:t>
+      </w:r>
+      <w:proofErr w:type="spellEnd"/>
+      <w:r>
+        <w:rPr>
+          <w:lang w:val="ru-RU"/>
+        </w:rPr>
+        <w:t xml:space="preserve">: </w:t>
+      </w:r>
+      <w:proofErr w:type="spellStart"/>
+      <w:r>
+        <w:rPr>
+          <w:lang w:val="ru-RU"/>
+        </w:rPr>
+        <w:t>str</w:t>
+      </w:r>
+      <w:proofErr w:type="spellEnd"/>
+      <w:r>
+        <w:rPr>
+          <w:lang w:val="ru-RU"/>
+        </w:rPr>
+        <w:t xml:space="preserve"> = "Base </w:t>
+      </w:r>
+      <w:proofErr w:type="spellStart"/>
+      <w:r>
+        <w:rPr>
+          <w:lang w:val="ru-RU"/>
+        </w:rPr>
+        <w:t>Exporter</w:t>
+      </w:r>
+      <w:proofErr w:type="spellEnd"/>
+      <w:r>
+        <w:rPr>
+          <w:lang w:val="ru-RU"/>
+        </w:rPr>
+        <w:t>"</w:t>
+      </w:r>
+    </w:p>
+    <w:p>
+      <w:pPr>
+        <w:pStyle w:val="a9"/>
+        <w:rPr>
+          <w:lang w:val="ru-RU"/>
+        </w:rPr>
+      </w:pPr>
+    </w:p>
+    <w:p>
+      <w:pPr>
+        <w:pStyle w:val="a9"/>
+        <w:rPr>
+          <w:lang w:val="ru-RU"/>
+        </w:rPr>
+      </w:pPr>
+      <w:r>
+        <w:rPr>
+          <w:lang w:val="ru-RU"/>
+        </w:rPr>
+        <w:t xml:space="preserve">    </w:t>
+      </w:r>
+      <w:proofErr w:type="spellStart"/>
+      <w:r>
+        <w:rPr>
+          <w:lang w:val="ru-RU"/>
+        </w:rPr>
+        <w:t>def</w:t>
+      </w:r>
+      <w:proofErr w:type="spellEnd"/>
+      <w:r>
+        <w:rPr>
+          <w:lang w:val="ru-RU"/>
+        </w:rPr>
+        <w:t xml:space="preserve"> __</w:t>
+      </w:r>
+      <w:proofErr w:type="spellStart"/>
+      <w:r>
+        <w:rPr>
+          <w:lang w:val="ru-RU"/>
+        </w:rPr>
+        <w:t>init</w:t>
+      </w:r>
+      <w:proofErr w:type="spellEnd"/>
+      <w:r>
+        <w:rPr>
+          <w:lang w:val="ru-RU"/>
+        </w:rPr>
+        <w:t>__(</w:t>
+      </w:r>
+      <w:proofErr w:type="spellStart"/>
+      <w:r>
+        <w:rPr>
+          <w:lang w:val="ru-RU"/>
+        </w:rPr>
+        <w:t>self</w:t>
+      </w:r>
+      <w:proofErr w:type="spellEnd"/>
+      <w:r>
+        <w:rPr>
+          <w:lang w:val="ru-RU"/>
+        </w:rPr>
+        <w:t xml:space="preserve">, </w:t>
+      </w:r>
+      <w:proofErr w:type="spellStart"/>
+      <w:r>
+        <w:rPr>
+          <w:lang w:val="ru-RU"/>
+        </w:rPr>
+        <w:t>context</w:t>
+      </w:r>
+      <w:proofErr w:type="spellEnd"/>
+      <w:r>
+        <w:rPr>
+          <w:lang w:val="ru-RU"/>
+        </w:rPr>
+        <w:t>):</w:t>
+      </w:r>
+    </w:p>
+    <w:p>
+      <w:pPr>
+        <w:pStyle w:val="a9"/>
+        <w:rPr>
+          <w:lang w:val="ru-RU"/>
+        </w:rPr>
+      </w:pPr>
+      <w:r>
+        <w:rPr>
+          <w:lang w:val="ru-RU"/>
+        </w:rPr>
+        <w:t xml:space="preserve">        </w:t>
+      </w:r>
+      <w:proofErr w:type="spellStart"/>
+      <w:r>
+        <w:rPr>
+          <w:lang w:val="ru-RU"/>
+        </w:rPr>
+        <w:t>self.context</w:t>
+      </w:r>
+      <w:proofErr w:type="spellEnd"/>
+      <w:r>
+        <w:rPr>
+          <w:lang w:val="ru-RU"/>
+        </w:rPr>
+        <w:t xml:space="preserve"> = </w:t>
+      </w:r>
+      <w:proofErr w:type="spellStart"/>
+      <w:r>
+        <w:rPr>
+          <w:lang w:val="ru-RU"/>
+        </w:rPr>
+        <w:t>context</w:t>
+      </w:r>
+      <w:proofErr w:type="spellEnd"/>
+    </w:p>
+    <w:p>
+      <w:pPr>
+        <w:pStyle w:val="a9"/>
+        <w:rPr>
+          <w:lang w:val="ru-RU"/>
+        </w:rPr>
+      </w:pPr>
+      <w:r>
+        <w:rPr>
+          <w:lang w:val="ru-RU"/>
+        </w:rPr>
+        <w:t xml:space="preserve">        </w:t>
+      </w:r>
+      <w:proofErr w:type="spellStart"/>
+      <w:r>
+        <w:rPr>
+          <w:lang w:val="ru-RU"/>
+        </w:rPr>
+        <w:t>self.last_response</w:t>
+      </w:r>
+      <w:proofErr w:type="spellEnd"/>
+      <w:r>
+        <w:rPr>
+          <w:lang w:val="ru-RU"/>
+        </w:rPr>
+        <w:t xml:space="preserve"> = </w:t>
+      </w:r>
+      <w:proofErr w:type="spellStart"/>
+      <w:r>
+        <w:rPr>
+          <w:lang w:val="ru-RU"/>
+        </w:rPr>
+        <w:t>None</w:t>
+      </w:r>
+      <w:proofErr w:type="spellEnd"/>
+    </w:p>
+    <w:p>
+      <w:pPr>
+        <w:pStyle w:val="a9"/>
+        <w:rPr>
+          <w:lang w:val="ru-RU"/>
+        </w:rPr>
+      </w:pPr>
+      <w:r>
+        <w:rPr>
+          <w:lang w:val="ru-RU"/>
+        </w:rPr>
+        <w:t xml:space="preserve">        </w:t>
+      </w:r>
+    </w:p>
+    <w:p>
+      <w:pPr>
+        <w:pStyle w:val="a9"/>
+        <w:rPr>
+          <w:lang w:val="ru-RU"/>
+        </w:rPr>
+      </w:pPr>
+      <w:r>
+        <w:rPr>
+          <w:lang w:val="ru-RU"/>
+        </w:rPr>
+        <w:t xml:space="preserve">        </w:t>
+      </w:r>
+      <w:proofErr w:type="spellStart"/>
+      <w:r>
+        <w:rPr>
+          <w:lang w:val="ru-RU"/>
+        </w:rPr>
+        <w:t>self.context.events.subscribe</w:t>
+      </w:r>
+      <w:proofErr w:type="spellEnd"/>
+      <w:r>
+        <w:rPr>
+          <w:lang w:val="ru-RU"/>
+        </w:rPr>
         <w:t>(</w:t>
       </w:r>
-      <w:proofErr w:type="gramEnd"/>
-      <w:r>
-        <w:rPr>
-          <w:lang w:val="ru-RU"/>
-        </w:rPr>
-        <w:t>ABC):</w:t>
-      </w:r>
+      <w:proofErr w:type="spellStart"/>
+      <w:r>
+        <w:rPr>
+          <w:lang w:val="ru-RU"/>
+        </w:rPr>
+        <w:t>self</w:t>
+      </w:r>
+      <w:proofErr w:type="spellEnd"/>
+      <w:r>
+        <w:rPr>
+          <w:lang w:val="ru-RU"/>
+        </w:rPr>
+        <w:t>)</w:t>
+      </w:r>
+    </w:p>
+    <w:p>
+      <w:pPr>
+        <w:pStyle w:val="a9"/>
+        <w:rPr>
+          <w:lang w:val="ru-RU"/>
+        </w:rPr>
+      </w:pPr>
     </w:p>
     <w:p>
       <w:pPr>
@@ -1456,7 +1955,253 @@
         <w:rPr>
           <w:lang w:val="ru-RU"/>
         </w:rPr>
-        <w:t>display_name</w:t>
+        <w:t>def</w:t>
+      </w:r>
+      <w:proofErr w:type="spellEnd"/>
+      <w:r>
+        <w:rPr>
+          <w:lang w:val="ru-RU"/>
+        </w:rPr>
+        <w:t xml:space="preserve"> </w:t>
+      </w:r>
+      <w:proofErr w:type="spellStart"/>
+      <w:r>
+        <w:rPr>
+          <w:lang w:val="ru-RU"/>
+        </w:rPr>
+        <w:t>handle_event</w:t>
+      </w:r>
+      <w:proofErr w:type="spellEnd"/>
+      <w:r>
+        <w:rPr>
+          <w:lang w:val="ru-RU"/>
+        </w:rPr>
+        <w:t>(</w:t>
+      </w:r>
+      <w:proofErr w:type="spellStart"/>
+      <w:r>
+        <w:rPr>
+          <w:lang w:val="ru-RU"/>
+        </w:rPr>
+        <w:t>self</w:t>
+      </w:r>
+      <w:proofErr w:type="spellEnd"/>
+      <w:r>
+        <w:rPr>
+          <w:lang w:val="ru-RU"/>
+        </w:rPr>
+        <w:t xml:space="preserve">, </w:t>
+      </w:r>
+      <w:proofErr w:type="spellStart"/>
+      <w:r>
+        <w:rPr>
+          <w:lang w:val="ru-RU"/>
+        </w:rPr>
+        <w:t>event</w:t>
+      </w:r>
+      <w:proofErr w:type="spellEnd"/>
+      <w:r>
+        <w:rPr>
+          <w:lang w:val="ru-RU"/>
+        </w:rPr>
+        <w:t>):</w:t>
+      </w:r>
+    </w:p>
+    <w:p>
+      <w:pPr>
+        <w:pStyle w:val="a9"/>
+        <w:rPr>
+          <w:lang w:val="ru-RU"/>
+        </w:rPr>
+      </w:pPr>
+      <w:r>
+        <w:rPr>
+          <w:lang w:val="ru-RU"/>
+        </w:rPr>
+        <w:t xml:space="preserve">        </w:t>
+      </w:r>
+      <w:proofErr w:type="spellStart"/>
+      <w:r>
+        <w:rPr>
+          <w:lang w:val="ru-RU"/>
+        </w:rPr>
+        <w:t>if</w:t>
+      </w:r>
+      <w:proofErr w:type="spellEnd"/>
+      <w:r>
+        <w:rPr>
+          <w:lang w:val="ru-RU"/>
+        </w:rPr>
+        <w:t xml:space="preserve"> </w:t>
+      </w:r>
+      <w:proofErr w:type="spellStart"/>
+      <w:r>
+        <w:rPr>
+          <w:lang w:val="ru-RU"/>
+        </w:rPr>
+        <w:t>event.type</w:t>
+      </w:r>
+      <w:proofErr w:type="spellEnd"/>
+      <w:r>
+        <w:rPr>
+          <w:lang w:val="ru-RU"/>
+        </w:rPr>
+        <w:t xml:space="preserve"> == </w:t>
+      </w:r>
+      <w:proofErr w:type="spellStart"/>
+      <w:r>
+        <w:rPr>
+          <w:lang w:val="ru-RU"/>
+        </w:rPr>
+        <w:t>EventType.COMMAND_EXECUTED</w:t>
+      </w:r>
+      <w:proofErr w:type="spellEnd"/>
+      <w:r>
+        <w:rPr>
+          <w:lang w:val="ru-RU"/>
+        </w:rPr>
+        <w:t>:</w:t>
+      </w:r>
+    </w:p>
+    <w:p>
+      <w:pPr>
+        <w:pStyle w:val="a9"/>
+        <w:rPr>
+          <w:lang w:val="ru-RU"/>
+        </w:rPr>
+      </w:pPr>
+      <w:r>
+        <w:rPr>
+          <w:lang w:val="ru-RU"/>
+        </w:rPr>
+        <w:t xml:space="preserve">            </w:t>
+      </w:r>
+      <w:proofErr w:type="spellStart"/>
+      <w:r>
+        <w:rPr>
+          <w:lang w:val="ru-RU"/>
+        </w:rPr>
+        <w:t>self.last_response</w:t>
+      </w:r>
+      <w:proofErr w:type="spellEnd"/>
+      <w:r>
+        <w:rPr>
+          <w:lang w:val="ru-RU"/>
+        </w:rPr>
+        <w:t xml:space="preserve"> = </w:t>
+      </w:r>
+      <w:proofErr w:type="spellStart"/>
+      <w:r>
+        <w:rPr>
+          <w:lang w:val="ru-RU"/>
+        </w:rPr>
+        <w:t>event.data.get</w:t>
+      </w:r>
+      <w:proofErr w:type="spellEnd"/>
+      <w:r>
+        <w:rPr>
+          <w:lang w:val="ru-RU"/>
+        </w:rPr>
+        <w:t>("</w:t>
+      </w:r>
+      <w:proofErr w:type="spellStart"/>
+      <w:r>
+        <w:rPr>
+          <w:lang w:val="ru-RU"/>
+        </w:rPr>
+        <w:t>result</w:t>
+      </w:r>
+      <w:proofErr w:type="spellEnd"/>
+      <w:r>
+        <w:rPr>
+          <w:lang w:val="ru-RU"/>
+        </w:rPr>
+        <w:t>")</w:t>
+      </w:r>
+    </w:p>
+    <w:p>
+      <w:pPr>
+        <w:pStyle w:val="a9"/>
+        <w:rPr>
+          <w:lang w:val="ru-RU"/>
+        </w:rPr>
+      </w:pPr>
+    </w:p>
+    <w:p>
+      <w:pPr>
+        <w:pStyle w:val="a9"/>
+        <w:rPr>
+          <w:lang w:val="ru-RU"/>
+        </w:rPr>
+      </w:pPr>
+      <w:r>
+        <w:rPr>
+          <w:lang w:val="ru-RU"/>
+        </w:rPr>
+        <w:t xml:space="preserve">    @abstractmethod</w:t>
+      </w:r>
+    </w:p>
+    <w:p>
+      <w:pPr>
+        <w:pStyle w:val="a9"/>
+        <w:rPr>
+          <w:lang w:val="ru-RU"/>
+        </w:rPr>
+      </w:pPr>
+      <w:r>
+        <w:rPr>
+          <w:lang w:val="ru-RU"/>
+        </w:rPr>
+        <w:t xml:space="preserve">    </w:t>
+      </w:r>
+      <w:proofErr w:type="spellStart"/>
+      <w:r>
+        <w:rPr>
+          <w:lang w:val="ru-RU"/>
+        </w:rPr>
+        <w:t>def</w:t>
+      </w:r>
+      <w:proofErr w:type="spellEnd"/>
+      <w:r>
+        <w:rPr>
+          <w:lang w:val="ru-RU"/>
+        </w:rPr>
+        <w:t xml:space="preserve"> </w:t>
+      </w:r>
+      <w:proofErr w:type="spellStart"/>
+      <w:r>
+        <w:rPr>
+          <w:lang w:val="ru-RU"/>
+        </w:rPr>
+        <w:t>export</w:t>
+      </w:r>
+      <w:proofErr w:type="spellEnd"/>
+      <w:r>
+        <w:rPr>
+          <w:lang w:val="ru-RU"/>
+        </w:rPr>
+        <w:t>(</w:t>
+      </w:r>
+      <w:proofErr w:type="spellStart"/>
+      <w:r>
+        <w:rPr>
+          <w:lang w:val="ru-RU"/>
+        </w:rPr>
+        <w:t>self</w:t>
+      </w:r>
+      <w:proofErr w:type="spellEnd"/>
+      <w:r>
+        <w:rPr>
+          <w:lang w:val="ru-RU"/>
+        </w:rPr>
+        <w:t xml:space="preserve">, </w:t>
+      </w:r>
+      <w:proofErr w:type="spellStart"/>
+      <w:r>
+        <w:rPr>
+          <w:lang w:val="ru-RU"/>
+        </w:rPr>
+        <w:t>destination</w:t>
       </w:r>
       <w:proofErr w:type="spellEnd"/>
       <w:r>
@@ -1477,92 +2222,6 @@
         <w:rPr>
           <w:lang w:val="ru-RU"/>
         </w:rPr>
-        <w:t xml:space="preserve"> = "Base </w:t>
-      </w:r>
-      <w:proofErr w:type="spellStart"/>
-      <w:r>
-        <w:rPr>
-          <w:lang w:val="ru-RU"/>
-        </w:rPr>
-        <w:t>Exporter</w:t>
-      </w:r>
-      <w:proofErr w:type="spellEnd"/>
-      <w:r>
-        <w:rPr>
-          <w:lang w:val="ru-RU"/>
-        </w:rPr>
-        <w:t>"</w:t>
-      </w:r>
-    </w:p>
-    <w:p>
-      <w:pPr>
-        <w:pStyle w:val="a9"/>
-        <w:rPr>
-          <w:lang w:val="ru-RU"/>
-        </w:rPr>
-      </w:pPr>
-    </w:p>
-    <w:p>
-      <w:pPr>
-        <w:pStyle w:val="a9"/>
-        <w:rPr>
-          <w:lang w:val="ru-RU"/>
-        </w:rPr>
-      </w:pPr>
-      <w:r>
-        <w:rPr>
-          <w:lang w:val="ru-RU"/>
-        </w:rPr>
-        <w:t xml:space="preserve">    </w:t>
-      </w:r>
-      <w:proofErr w:type="spellStart"/>
-      <w:r>
-        <w:rPr>
-          <w:lang w:val="ru-RU"/>
-        </w:rPr>
-        <w:t>def</w:t>
-      </w:r>
-      <w:proofErr w:type="spellEnd"/>
-      <w:r>
-        <w:rPr>
-          <w:lang w:val="ru-RU"/>
-        </w:rPr>
-        <w:t xml:space="preserve"> __</w:t>
-      </w:r>
-      <w:proofErr w:type="spellStart"/>
-      <w:r>
-        <w:rPr>
-          <w:lang w:val="ru-RU"/>
-        </w:rPr>
-        <w:t>init</w:t>
-      </w:r>
-      <w:proofErr w:type="spellEnd"/>
-      <w:r>
-        <w:rPr>
-          <w:lang w:val="ru-RU"/>
-        </w:rPr>
-        <w:t>_</w:t>
-      </w:r>
-      <w:proofErr w:type="gramStart"/>
-      <w:r>
-        <w:rPr>
-          <w:lang w:val="ru-RU"/>
-        </w:rPr>
-        <w:t>_(</w:t>
-      </w:r>
-      <w:proofErr w:type="spellStart"/>
-      <w:proofErr w:type="gramEnd"/>
-      <w:r>
-        <w:rPr>
-          <w:lang w:val="ru-RU"/>
-        </w:rPr>
-        <w:t>self</w:t>
-      </w:r>
-      <w:proofErr w:type="spellEnd"/>
-      <w:r>
-        <w:rPr>
-          <w:lang w:val="ru-RU"/>
-        </w:rPr>
         <w:t xml:space="preserve">, </w:t>
       </w:r>
       <w:proofErr w:type="spellStart"/>
@@ -1570,14 +2229,14 @@
         <w:rPr>
           <w:lang w:val="ru-RU"/>
         </w:rPr>
-        <w:t>context</w:t>
-      </w:r>
-      <w:proofErr w:type="spellEnd"/>
-      <w:r>
-        <w:rPr>
-          <w:lang w:val="ru-RU"/>
-        </w:rPr>
-        <w:t>):</w:t>
+        <w:t>data</w:t>
+      </w:r>
+      <w:proofErr w:type="spellEnd"/>
+      <w:r>
+        <w:rPr>
+          <w:lang w:val="ru-RU"/>
+        </w:rPr>
+        <w:t>: Response):</w:t>
       </w:r>
     </w:p>
     <w:p>
@@ -1594,482 +2253,6 @@
         <w:t xml:space="preserve">        </w:t>
       </w:r>
       <w:proofErr w:type="spellStart"/>
-      <w:proofErr w:type="gramStart"/>
-      <w:r>
-        <w:rPr>
-          <w:lang w:val="ru-RU"/>
-        </w:rPr>
-        <w:t>self.context</w:t>
-      </w:r>
-      <w:proofErr w:type="spellEnd"/>
-      <w:proofErr w:type="gramEnd"/>
-      <w:r>
-        <w:rPr>
-          <w:lang w:val="ru-RU"/>
-        </w:rPr>
-        <w:t xml:space="preserve"> = </w:t>
-      </w:r>
-      <w:proofErr w:type="spellStart"/>
-      <w:r>
-        <w:rPr>
-          <w:lang w:val="ru-RU"/>
-        </w:rPr>
-        <w:t>context</w:t>
-      </w:r>
-      <w:proofErr w:type="spellEnd"/>
-    </w:p>
-    <w:p>
-      <w:pPr>
-        <w:pStyle w:val="a9"/>
-        <w:rPr>
-          <w:lang w:val="ru-RU"/>
-        </w:rPr>
-      </w:pPr>
-      <w:r>
-        <w:rPr>
-          <w:lang w:val="ru-RU"/>
-        </w:rPr>
-        <w:t xml:space="preserve">        </w:t>
-      </w:r>
-      <w:proofErr w:type="spellStart"/>
-      <w:proofErr w:type="gramStart"/>
-      <w:r>
-        <w:rPr>
-          <w:lang w:val="ru-RU"/>
-        </w:rPr>
-        <w:t>self.last</w:t>
-      </w:r>
-      <w:proofErr w:type="gramEnd"/>
-      <w:r>
-        <w:rPr>
-          <w:lang w:val="ru-RU"/>
-        </w:rPr>
-        <w:t>_response</w:t>
-      </w:r>
-      <w:proofErr w:type="spellEnd"/>
-      <w:r>
-        <w:rPr>
-          <w:lang w:val="ru-RU"/>
-        </w:rPr>
-        <w:t xml:space="preserve"> = </w:t>
-      </w:r>
-      <w:proofErr w:type="spellStart"/>
-      <w:r>
-        <w:rPr>
-          <w:lang w:val="ru-RU"/>
-        </w:rPr>
-        <w:t>None</w:t>
-      </w:r>
-      <w:proofErr w:type="spellEnd"/>
-    </w:p>
-    <w:p>
-      <w:pPr>
-        <w:pStyle w:val="a9"/>
-        <w:rPr>
-          <w:lang w:val="ru-RU"/>
-        </w:rPr>
-      </w:pPr>
-      <w:r>
-        <w:rPr>
-          <w:lang w:val="ru-RU"/>
-        </w:rPr>
-        <w:t xml:space="preserve">        </w:t>
-      </w:r>
-    </w:p>
-    <w:p>
-      <w:pPr>
-        <w:pStyle w:val="a9"/>
-        <w:rPr>
-          <w:lang w:val="ru-RU"/>
-        </w:rPr>
-      </w:pPr>
-      <w:r>
-        <w:rPr>
-          <w:lang w:val="ru-RU"/>
-        </w:rPr>
-        <w:t xml:space="preserve">        </w:t>
-      </w:r>
-      <w:proofErr w:type="spellStart"/>
-      <w:proofErr w:type="gramStart"/>
-      <w:r>
-        <w:rPr>
-          <w:lang w:val="ru-RU"/>
-        </w:rPr>
-        <w:t>self.context</w:t>
-      </w:r>
-      <w:proofErr w:type="gramEnd"/>
-      <w:r>
-        <w:rPr>
-          <w:lang w:val="ru-RU"/>
-        </w:rPr>
-        <w:t>.events.subscribe</w:t>
-      </w:r>
-      <w:proofErr w:type="spellEnd"/>
-      <w:r>
-        <w:rPr>
-          <w:lang w:val="ru-RU"/>
-        </w:rPr>
-        <w:t>(</w:t>
-      </w:r>
-      <w:proofErr w:type="spellStart"/>
-      <w:r>
-        <w:rPr>
-          <w:lang w:val="ru-RU"/>
-        </w:rPr>
-        <w:t>self</w:t>
-      </w:r>
-      <w:proofErr w:type="spellEnd"/>
-      <w:r>
-        <w:rPr>
-          <w:lang w:val="ru-RU"/>
-        </w:rPr>
-        <w:t>)</w:t>
-      </w:r>
-    </w:p>
-    <w:p>
-      <w:pPr>
-        <w:pStyle w:val="a9"/>
-        <w:rPr>
-          <w:lang w:val="ru-RU"/>
-        </w:rPr>
-      </w:pPr>
-    </w:p>
-    <w:p>
-      <w:pPr>
-        <w:pStyle w:val="a9"/>
-        <w:rPr>
-          <w:lang w:val="ru-RU"/>
-        </w:rPr>
-      </w:pPr>
-      <w:r>
-        <w:rPr>
-          <w:lang w:val="ru-RU"/>
-        </w:rPr>
-        <w:t xml:space="preserve">    </w:t>
-      </w:r>
-      <w:proofErr w:type="spellStart"/>
-      <w:r>
-        <w:rPr>
-          <w:lang w:val="ru-RU"/>
-        </w:rPr>
-        <w:t>def</w:t>
-      </w:r>
-      <w:proofErr w:type="spellEnd"/>
-      <w:r>
-        <w:rPr>
-          <w:lang w:val="ru-RU"/>
-        </w:rPr>
-        <w:t xml:space="preserve"> </w:t>
-      </w:r>
-      <w:proofErr w:type="spellStart"/>
-      <w:r>
-        <w:rPr>
-          <w:lang w:val="ru-RU"/>
-        </w:rPr>
-        <w:t>handle_</w:t>
-      </w:r>
-      <w:proofErr w:type="gramStart"/>
-      <w:r>
-        <w:rPr>
-          <w:lang w:val="ru-RU"/>
-        </w:rPr>
-        <w:t>event</w:t>
-      </w:r>
-      <w:proofErr w:type="spellEnd"/>
-      <w:r>
-        <w:rPr>
-          <w:lang w:val="ru-RU"/>
-        </w:rPr>
-        <w:t>(</w:t>
-      </w:r>
-      <w:proofErr w:type="spellStart"/>
-      <w:proofErr w:type="gramEnd"/>
-      <w:r>
-        <w:rPr>
-          <w:lang w:val="ru-RU"/>
-        </w:rPr>
-        <w:t>self</w:t>
-      </w:r>
-      <w:proofErr w:type="spellEnd"/>
-      <w:r>
-        <w:rPr>
-          <w:lang w:val="ru-RU"/>
-        </w:rPr>
-        <w:t xml:space="preserve">, </w:t>
-      </w:r>
-      <w:proofErr w:type="spellStart"/>
-      <w:r>
-        <w:rPr>
-          <w:lang w:val="ru-RU"/>
-        </w:rPr>
-        <w:t>event</w:t>
-      </w:r>
-      <w:proofErr w:type="spellEnd"/>
-      <w:r>
-        <w:rPr>
-          <w:lang w:val="ru-RU"/>
-        </w:rPr>
-        <w:t>):</w:t>
-      </w:r>
-    </w:p>
-    <w:p>
-      <w:pPr>
-        <w:pStyle w:val="a9"/>
-        <w:rPr>
-          <w:lang w:val="ru-RU"/>
-        </w:rPr>
-      </w:pPr>
-      <w:r>
-        <w:rPr>
-          <w:lang w:val="ru-RU"/>
-        </w:rPr>
-        <w:t xml:space="preserve">        </w:t>
-      </w:r>
-      <w:proofErr w:type="spellStart"/>
-      <w:r>
-        <w:rPr>
-          <w:lang w:val="ru-RU"/>
-        </w:rPr>
-        <w:t>if</w:t>
-      </w:r>
-      <w:proofErr w:type="spellEnd"/>
-      <w:r>
-        <w:rPr>
-          <w:lang w:val="ru-RU"/>
-        </w:rPr>
-        <w:t xml:space="preserve"> </w:t>
-      </w:r>
-      <w:proofErr w:type="spellStart"/>
-      <w:proofErr w:type="gramStart"/>
-      <w:r>
-        <w:rPr>
-          <w:lang w:val="ru-RU"/>
-        </w:rPr>
-        <w:t>event.type</w:t>
-      </w:r>
-      <w:proofErr w:type="spellEnd"/>
-      <w:proofErr w:type="gramEnd"/>
-      <w:r>
-        <w:rPr>
-          <w:lang w:val="ru-RU"/>
-        </w:rPr>
-        <w:t xml:space="preserve"> == </w:t>
-      </w:r>
-      <w:proofErr w:type="spellStart"/>
-      <w:r>
-        <w:rPr>
-          <w:lang w:val="ru-RU"/>
-        </w:rPr>
-        <w:t>EventType.COMMAND_EXECUTED</w:t>
-      </w:r>
-      <w:proofErr w:type="spellEnd"/>
-      <w:r>
-        <w:rPr>
-          <w:lang w:val="ru-RU"/>
-        </w:rPr>
-        <w:t>:</w:t>
-      </w:r>
-    </w:p>
-    <w:p>
-      <w:pPr>
-        <w:pStyle w:val="a9"/>
-        <w:rPr>
-          <w:lang w:val="ru-RU"/>
-        </w:rPr>
-      </w:pPr>
-      <w:r>
-        <w:rPr>
-          <w:lang w:val="ru-RU"/>
-        </w:rPr>
-        <w:t xml:space="preserve">            </w:t>
-      </w:r>
-      <w:proofErr w:type="spellStart"/>
-      <w:proofErr w:type="gramStart"/>
-      <w:r>
-        <w:rPr>
-          <w:lang w:val="ru-RU"/>
-        </w:rPr>
-        <w:t>self.last</w:t>
-      </w:r>
-      <w:proofErr w:type="gramEnd"/>
-      <w:r>
-        <w:rPr>
-          <w:lang w:val="ru-RU"/>
-        </w:rPr>
-        <w:t>_response</w:t>
-      </w:r>
-      <w:proofErr w:type="spellEnd"/>
-      <w:r>
-        <w:rPr>
-          <w:lang w:val="ru-RU"/>
-        </w:rPr>
-        <w:t xml:space="preserve"> = </w:t>
-      </w:r>
-      <w:proofErr w:type="spellStart"/>
-      <w:r>
-        <w:rPr>
-          <w:lang w:val="ru-RU"/>
-        </w:rPr>
-        <w:t>event.data.get</w:t>
-      </w:r>
-      <w:proofErr w:type="spellEnd"/>
-      <w:r>
-        <w:rPr>
-          <w:lang w:val="ru-RU"/>
-        </w:rPr>
-        <w:t>("</w:t>
-      </w:r>
-      <w:proofErr w:type="spellStart"/>
-      <w:r>
-        <w:rPr>
-          <w:lang w:val="ru-RU"/>
-        </w:rPr>
-        <w:t>result</w:t>
-      </w:r>
-      <w:proofErr w:type="spellEnd"/>
-      <w:r>
-        <w:rPr>
-          <w:lang w:val="ru-RU"/>
-        </w:rPr>
-        <w:t>")</w:t>
-      </w:r>
-    </w:p>
-    <w:p>
-      <w:pPr>
-        <w:pStyle w:val="a9"/>
-        <w:rPr>
-          <w:lang w:val="ru-RU"/>
-        </w:rPr>
-      </w:pPr>
-    </w:p>
-    <w:p>
-      <w:pPr>
-        <w:pStyle w:val="a9"/>
-        <w:rPr>
-          <w:lang w:val="ru-RU"/>
-        </w:rPr>
-      </w:pPr>
-      <w:r>
-        <w:rPr>
-          <w:lang w:val="ru-RU"/>
-        </w:rPr>
-        <w:t xml:space="preserve">    @abstractmethod</w:t>
-      </w:r>
-    </w:p>
-    <w:p>
-      <w:pPr>
-        <w:pStyle w:val="a9"/>
-        <w:rPr>
-          <w:lang w:val="ru-RU"/>
-        </w:rPr>
-      </w:pPr>
-      <w:r>
-        <w:rPr>
-          <w:lang w:val="ru-RU"/>
-        </w:rPr>
-        <w:t xml:space="preserve">    </w:t>
-      </w:r>
-      <w:proofErr w:type="spellStart"/>
-      <w:r>
-        <w:rPr>
-          <w:lang w:val="ru-RU"/>
-        </w:rPr>
-        <w:t>def</w:t>
-      </w:r>
-      <w:proofErr w:type="spellEnd"/>
-      <w:r>
-        <w:rPr>
-          <w:lang w:val="ru-RU"/>
-        </w:rPr>
-        <w:t xml:space="preserve"> </w:t>
-      </w:r>
-      <w:proofErr w:type="spellStart"/>
-      <w:proofErr w:type="gramStart"/>
-      <w:r>
-        <w:rPr>
-          <w:lang w:val="ru-RU"/>
-        </w:rPr>
-        <w:t>export</w:t>
-      </w:r>
-      <w:proofErr w:type="spellEnd"/>
-      <w:r>
-        <w:rPr>
-          <w:lang w:val="ru-RU"/>
-        </w:rPr>
-        <w:t>(</w:t>
-      </w:r>
-      <w:proofErr w:type="spellStart"/>
-      <w:proofErr w:type="gramEnd"/>
-      <w:r>
-        <w:rPr>
-          <w:lang w:val="ru-RU"/>
-        </w:rPr>
-        <w:t>self</w:t>
-      </w:r>
-      <w:proofErr w:type="spellEnd"/>
-      <w:r>
-        <w:rPr>
-          <w:lang w:val="ru-RU"/>
-        </w:rPr>
-        <w:t xml:space="preserve">, </w:t>
-      </w:r>
-      <w:proofErr w:type="spellStart"/>
-      <w:r>
-        <w:rPr>
-          <w:lang w:val="ru-RU"/>
-        </w:rPr>
-        <w:t>destination</w:t>
-      </w:r>
-      <w:proofErr w:type="spellEnd"/>
-      <w:r>
-        <w:rPr>
-          <w:lang w:val="ru-RU"/>
-        </w:rPr>
-        <w:t xml:space="preserve">: </w:t>
-      </w:r>
-      <w:proofErr w:type="spellStart"/>
-      <w:r>
-        <w:rPr>
-          <w:lang w:val="ru-RU"/>
-        </w:rPr>
-        <w:t>str</w:t>
-      </w:r>
-      <w:proofErr w:type="spellEnd"/>
-      <w:r>
-        <w:rPr>
-          <w:lang w:val="ru-RU"/>
-        </w:rPr>
-        <w:t xml:space="preserve">, </w:t>
-      </w:r>
-      <w:proofErr w:type="spellStart"/>
-      <w:r>
-        <w:rPr>
-          <w:lang w:val="ru-RU"/>
-        </w:rPr>
-        <w:t>data</w:t>
-      </w:r>
-      <w:proofErr w:type="spellEnd"/>
-      <w:r>
-        <w:rPr>
-          <w:lang w:val="ru-RU"/>
-        </w:rPr>
-        <w:t>: Response):</w:t>
-      </w:r>
-    </w:p>
-    <w:p>
-      <w:pPr>
-        <w:pStyle w:val="a9"/>
-        <w:rPr>
-          <w:lang w:val="ru-RU"/>
-        </w:rPr>
-      </w:pPr>
-      <w:r>
-        <w:rPr>
-          <w:lang w:val="ru-RU"/>
-        </w:rPr>
-        <w:t xml:space="preserve">        </w:t>
-      </w:r>
-      <w:proofErr w:type="spellStart"/>
       <w:r>
         <w:rPr>
           <w:lang w:val="ru-RU"/>
@@ -2086,6 +2269,7 @@
         </w:rPr>
       </w:pPr>
       <w:bookmarkStart w:id="3" w:name="_Toc225335300_Copy_1"/>
+      <w:bookmarkStart w:id="4" w:name="_Toc229944569"/>
       <w:r>
         <w:rPr>
           <w:lang w:val="ru-RU"/>
@@ -2105,12 +2289,12 @@
         </w:rPr>
         <w:t>exporters/excel/exporter.py</w:t>
       </w:r>
-    </w:p>
-    <w:p>
-      <w:pPr>
-        <w:pStyle w:val="a9"/>
-      </w:pPr>
-      <w:bookmarkStart w:id="4" w:name="_Toc225335301"/>
+      <w:bookmarkEnd w:id="4"/>
+    </w:p>
+    <w:p>
+      <w:pPr>
+        <w:pStyle w:val="a9"/>
+      </w:pPr>
       <w:proofErr w:type="spellStart"/>
       <w:r>
         <w:t>import</w:t>
@@ -5577,12 +5761,14 @@
       <w:pPr>
         <w:pStyle w:val="2"/>
       </w:pPr>
+      <w:bookmarkStart w:id="5" w:name="_Toc229944570"/>
       <w:r>
         <w:t xml:space="preserve">Уривок коду </w:t>
       </w:r>
       <w:r>
         <w:t>UI/gui/TkinterViewer.py</w:t>
       </w:r>
+      <w:bookmarkEnd w:id="5"/>
     </w:p>
     <w:p>
       <w:pPr>
@@ -6751,11 +6937,12 @@
       <w:pPr>
         <w:pStyle w:val="1"/>
       </w:pPr>
+      <w:bookmarkStart w:id="6" w:name="_Toc229944571"/>
       <w:r>
         <w:lastRenderedPageBreak/>
         <w:t>Діаграма</w:t>
       </w:r>
-      <w:bookmarkEnd w:id="4"/>
+      <w:bookmarkEnd w:id="6"/>
     </w:p>
     <w:p>
       <w:pPr>
@@ -6816,12 +7003,12 @@
       <w:pPr>
         <w:pStyle w:val="1"/>
       </w:pPr>
-      <w:bookmarkStart w:id="5" w:name="_Toc225335302"/>
+      <w:bookmarkStart w:id="7" w:name="_Toc229944572"/>
       <w:r>
         <w:lastRenderedPageBreak/>
         <w:t>Приклад використання модуля</w:t>
       </w:r>
-      <w:bookmarkEnd w:id="5"/>
+      <w:bookmarkEnd w:id="7"/>
     </w:p>
     <w:p>
       <w:pPr>
@@ -7071,11 +7258,11 @@
       <w:pPr>
         <w:pStyle w:val="1"/>
       </w:pPr>
-      <w:bookmarkStart w:id="6" w:name="_Toc225335303"/>
+      <w:bookmarkStart w:id="8" w:name="_Toc229944573"/>
       <w:r>
         <w:t>Висновки</w:t>
       </w:r>
-      <w:bookmarkEnd w:id="6"/>
+      <w:bookmarkEnd w:id="8"/>
     </w:p>
     <w:p>
       <w:r>
@@ -7092,11 +7279,11 @@
       <w:pPr>
         <w:pStyle w:val="1"/>
       </w:pPr>
-      <w:bookmarkStart w:id="7" w:name="_Toc225335304"/>
+      <w:bookmarkStart w:id="9" w:name="_Toc229944574"/>
       <w:r>
         <w:t>Джерела</w:t>
       </w:r>
-      <w:bookmarkEnd w:id="7"/>
+      <w:bookmarkEnd w:id="9"/>
     </w:p>
     <w:p>
       <w:pPr>
@@ -7107,27 +7294,24 @@
         </w:numPr>
         <w:ind w:left="0" w:firstLine="0"/>
       </w:pPr>
-      <w:r>
-        <w:t xml:space="preserve">Посилання на репозиторій </w:t>
-      </w:r>
-      <w:hyperlink r:id="rId13">
+      <w:hyperlink r:id="rId13" w:history="1">
         <w:r>
           <w:rPr>
             <w:rStyle w:val="aa"/>
           </w:rPr>
-          <w:t>https://github.com/Figeiron/IndividualCreativeA</w:t>
+          <w:t>Посилання на репозитор</w:t>
         </w:r>
         <w:r>
           <w:rPr>
             <w:rStyle w:val="aa"/>
           </w:rPr>
-          <w:t>s</w:t>
+          <w:t>і</w:t>
         </w:r>
         <w:r>
           <w:rPr>
             <w:rStyle w:val="aa"/>
           </w:rPr>
-          <w:t>signment</w:t>
+          <w:t>й</w:t>
         </w:r>
       </w:hyperlink>
     </w:p>

</xml_diff>